<commit_message>
Formato: numeracion automatica de tablas/figuras e indices auto-actualizables
- Rotulos de tablas y figuras con campos SEQ (numeracion automatica 1,2,3)
- Titulos de tabla movidos debajo de cada tabla, Arial 10 (segun instructivo)
- Insertados campos TOC para Tabla de contenidos, Indice de tablas e Indice de figuras
- Limpieza de parrafos vacios sobrantes entre indices

Co-authored-by: bastiansotopalma-crypto <300303357+bastiansotopalma-crypto@users.noreply.github.com>
</commit_message>
<xml_diff>
--- a/Tesis AVANCE 1 - Rev DJP (3).docx
+++ b/Tesis AVANCE 1 - Rev DJP (3).docx
@@ -1214,6 +1214,38 @@
         <w:t>TABLA DE CONTENIDOS</w:t>
       </w:r>
     </w:p>
+    <w:p>
+      <w:r>
+        <w:rPr>
+          <w:rFonts w:ascii="Arial" w:hAnsi="Arial" w:cs="Arial"/>
+        </w:rPr>
+        <w:fldChar w:fldCharType="begin"/>
+      </w:r>
+      <w:r>
+        <w:rPr>
+          <w:rFonts w:ascii="Arial" w:hAnsi="Arial" w:cs="Arial"/>
+        </w:rPr>
+        <w:instrText xml:space="preserve"> TOC \o "1-3" \h \z \u </w:instrText>
+      </w:r>
+      <w:r>
+        <w:rPr>
+          <w:rFonts w:ascii="Arial" w:hAnsi="Arial" w:cs="Arial"/>
+        </w:rPr>
+        <w:fldChar w:fldCharType="separate"/>
+      </w:r>
+      <w:r>
+        <w:rPr>
+          <w:rFonts w:ascii="Arial" w:hAnsi="Arial" w:cs="Arial"/>
+        </w:rPr>
+        <w:t>Haga clic derecho y elija "Actualizar campos" para generar este contenido.</w:t>
+      </w:r>
+      <w:r>
+        <w:rPr>
+          <w:rFonts w:ascii="Arial" w:hAnsi="Arial" w:cs="Arial"/>
+        </w:rPr>
+        <w:fldChar w:fldCharType="end"/>
+      </w:r>
+    </w:p>
     <w:sdt>
       <w:sdtPr>
         <w:rPr>
@@ -3293,169 +3325,53 @@
     <w:p>
       <w:pPr>
         <w:spacing w:line="360" w:lineRule="auto"/>
-        <w:jc w:val="both"/>
+        <w:jc w:val="center"/>
         <w:rPr>
           <w:b/>
           <w:bCs/>
           <w:lang w:val="es-MX"/>
         </w:rPr>
       </w:pPr>
-    </w:p>
-    <w:p>
-      <w:pPr>
-        <w:spacing w:line="360" w:lineRule="auto"/>
-        <w:jc w:val="both"/>
+      <w:r>
         <w:rPr>
           <w:b/>
           <w:bCs/>
           <w:lang w:val="es-MX"/>
         </w:rPr>
-      </w:pPr>
-    </w:p>
-    <w:p>
-      <w:pPr>
-        <w:spacing w:line="360" w:lineRule="auto"/>
-        <w:jc w:val="both"/>
-        <w:rPr>
-          <w:b/>
-          <w:bCs/>
-          <w:lang w:val="es-MX"/>
-        </w:rPr>
-      </w:pPr>
-    </w:p>
-    <w:p>
-      <w:pPr>
-        <w:spacing w:line="360" w:lineRule="auto"/>
-        <w:jc w:val="both"/>
-        <w:rPr>
-          <w:b/>
-          <w:bCs/>
-          <w:lang w:val="es-MX"/>
-        </w:rPr>
-      </w:pPr>
-    </w:p>
-    <w:p>
-      <w:pPr>
-        <w:spacing w:line="360" w:lineRule="auto"/>
-        <w:jc w:val="both"/>
-        <w:rPr>
-          <w:b/>
-          <w:bCs/>
-          <w:lang w:val="es-MX"/>
-        </w:rPr>
-      </w:pPr>
-    </w:p>
-    <w:p>
-      <w:pPr>
-        <w:spacing w:line="360" w:lineRule="auto"/>
-        <w:jc w:val="center"/>
-        <w:rPr>
-          <w:b/>
-          <w:bCs/>
-          <w:lang w:val="es-MX"/>
-        </w:rPr>
-      </w:pPr>
-      <w:r>
-        <w:rPr>
-          <w:b/>
-          <w:bCs/>
-          <w:lang w:val="es-MX"/>
-        </w:rPr>
         <w:t>ÍNDICE DE TABLAS</w:t>
       </w:r>
     </w:p>
     <w:p>
-      <w:pPr>
-        <w:spacing w:line="360" w:lineRule="auto"/>
-        <w:jc w:val="center"/>
-        <w:rPr>
-          <w:b/>
-          <w:bCs/>
-          <w:lang w:val="es-MX"/>
-        </w:rPr>
-      </w:pPr>
-    </w:p>
-    <w:p>
-      <w:pPr>
-        <w:spacing w:line="360" w:lineRule="auto"/>
-        <w:jc w:val="both"/>
-        <w:rPr>
-          <w:b/>
-          <w:bCs/>
-          <w:lang w:val="es-MX"/>
-        </w:rPr>
-      </w:pPr>
-    </w:p>
-    <w:p>
-      <w:pPr>
-        <w:pStyle w:val="TDC1"/>
-        <w:spacing w:line="360" w:lineRule="auto"/>
-        <w:rPr>
-          <w:rFonts w:cstheme="minorBidi"/>
-          <w:noProof/>
-          <w:kern w:val="2"/>
-          <w:lang w:val="es-419" w:eastAsia="es-419"/>
-        </w:rPr>
-      </w:pPr>
-    </w:p>
-    <w:p>
-      <w:pPr>
-        <w:rPr>
-          <w:lang w:val="es-419" w:eastAsia="es-419"/>
-        </w:rPr>
-      </w:pPr>
-    </w:p>
-    <w:p>
-      <w:pPr>
-        <w:rPr>
-          <w:lang w:val="es-419" w:eastAsia="es-419"/>
-        </w:rPr>
-      </w:pPr>
-    </w:p>
-    <w:p>
-      <w:pPr>
-        <w:rPr>
-          <w:lang w:val="es-419" w:eastAsia="es-419"/>
-        </w:rPr>
-      </w:pPr>
-    </w:p>
-    <w:p>
-      <w:pPr>
-        <w:rPr>
-          <w:lang w:val="es-419" w:eastAsia="es-419"/>
-        </w:rPr>
-      </w:pPr>
-    </w:p>
-    <w:p>
-      <w:pPr>
-        <w:rPr>
-          <w:lang w:val="es-419" w:eastAsia="es-419"/>
-        </w:rPr>
-      </w:pPr>
-    </w:p>
-    <w:p>
-      <w:pPr>
-        <w:rPr>
-          <w:lang w:val="es-419" w:eastAsia="es-419"/>
-        </w:rPr>
-      </w:pPr>
-    </w:p>
-    <w:p>
-      <w:pPr>
-        <w:rPr>
-          <w:lang w:val="es-419" w:eastAsia="es-419"/>
-        </w:rPr>
-      </w:pPr>
-    </w:p>
-    <w:p>
-      <w:pPr>
-        <w:tabs>
-          <w:tab w:val="center" w:pos="4277"/>
-        </w:tabs>
-        <w:rPr>
-          <w:lang w:val="es-419" w:eastAsia="es-419"/>
-        </w:rPr>
-      </w:pPr>
+      <w:r>
+        <w:rPr>
+          <w:rFonts w:ascii="Arial" w:hAnsi="Arial" w:cs="Arial"/>
+        </w:rPr>
+        <w:fldChar w:fldCharType="begin"/>
+      </w:r>
+      <w:r>
+        <w:rPr>
+          <w:rFonts w:ascii="Arial" w:hAnsi="Arial" w:cs="Arial"/>
+        </w:rPr>
+        <w:instrText xml:space="preserve"> TOC \h \z \c "Tabla" </w:instrText>
+      </w:r>
+      <w:r>
+        <w:rPr>
+          <w:rFonts w:ascii="Arial" w:hAnsi="Arial" w:cs="Arial"/>
+        </w:rPr>
+        <w:fldChar w:fldCharType="separate"/>
+      </w:r>
+      <w:r>
+        <w:rPr>
+          <w:rFonts w:ascii="Arial" w:hAnsi="Arial" w:cs="Arial"/>
+        </w:rPr>
+        <w:t>Haga clic derecho y elija "Actualizar campos" para generar este contenido.</w:t>
+      </w:r>
+      <w:r>
+        <w:rPr>
+          <w:rFonts w:ascii="Arial" w:hAnsi="Arial" w:cs="Arial"/>
+        </w:rPr>
+        <w:fldChar w:fldCharType="end"/>
+      </w:r>
     </w:p>
     <w:p>
       <w:r>
@@ -3498,6 +3414,38 @@
       </w:r>
     </w:p>
     <w:p>
+      <w:r>
+        <w:rPr>
+          <w:rFonts w:ascii="Arial" w:hAnsi="Arial" w:cs="Arial"/>
+        </w:rPr>
+        <w:fldChar w:fldCharType="begin"/>
+      </w:r>
+      <w:r>
+        <w:rPr>
+          <w:rFonts w:ascii="Arial" w:hAnsi="Arial" w:cs="Arial"/>
+        </w:rPr>
+        <w:instrText xml:space="preserve"> TOC \h \z \c "Figura" </w:instrText>
+      </w:r>
+      <w:r>
+        <w:rPr>
+          <w:rFonts w:ascii="Arial" w:hAnsi="Arial" w:cs="Arial"/>
+        </w:rPr>
+        <w:fldChar w:fldCharType="separate"/>
+      </w:r>
+      <w:r>
+        <w:rPr>
+          <w:rFonts w:ascii="Arial" w:hAnsi="Arial" w:cs="Arial"/>
+        </w:rPr>
+        <w:t>Haga clic derecho y elija "Actualizar campos" para generar este contenido.</w:t>
+      </w:r>
+      <w:r>
+        <w:rPr>
+          <w:rFonts w:ascii="Arial" w:hAnsi="Arial" w:cs="Arial"/>
+        </w:rPr>
+        <w:fldChar w:fldCharType="end"/>
+      </w:r>
+    </w:p>
+    <w:p>
       <w:pPr>
         <w:pStyle w:val="Ttulo"/>
         <w:jc w:val="center"/>
@@ -4219,11 +4167,6 @@
       </w:r>
       <w:r>
         <w:t>.</w:t>
-      </w:r>
-    </w:p>
-    <w:p>
-      <w:r>
-        <w:t>Tabla 1. Aspectos evaluados para identificar las brechas del programa según los pilares del Modelo CMO.</w:t>
       </w:r>
     </w:p>
     <w:tbl>
@@ -4479,6 +4422,57 @@
         </w:tc>
       </w:tr>
     </w:tbl>
+    <w:p>
+      <w:r>
+        <w:rPr>
+          <w:rFonts w:ascii="Arial" w:hAnsi="Arial" w:cs="Arial"/>
+          <w:sz w:val="20"/>
+        </w:rPr>
+        <w:t xml:space="preserve">Tabla </w:t>
+      </w:r>
+      <w:r>
+        <w:rPr>
+          <w:rFonts w:ascii="Arial" w:hAnsi="Arial" w:cs="Arial"/>
+          <w:sz w:val="20"/>
+        </w:rPr>
+        <w:fldChar w:fldCharType="begin"/>
+      </w:r>
+      <w:r>
+        <w:rPr>
+          <w:rFonts w:ascii="Arial" w:hAnsi="Arial" w:cs="Arial"/>
+          <w:sz w:val="20"/>
+        </w:rPr>
+        <w:instrText xml:space="preserve"> SEQ Tabla \* ARABIC </w:instrText>
+      </w:r>
+      <w:r>
+        <w:rPr>
+          <w:rFonts w:ascii="Arial" w:hAnsi="Arial" w:cs="Arial"/>
+          <w:sz w:val="20"/>
+        </w:rPr>
+        <w:fldChar w:fldCharType="separate"/>
+      </w:r>
+      <w:r>
+        <w:rPr>
+          <w:rFonts w:ascii="Arial" w:hAnsi="Arial" w:cs="Arial"/>
+          <w:sz w:val="20"/>
+        </w:rPr>
+        <w:t>1</w:t>
+      </w:r>
+      <w:r>
+        <w:rPr>
+          <w:rFonts w:ascii="Arial" w:hAnsi="Arial" w:cs="Arial"/>
+          <w:sz w:val="20"/>
+        </w:rPr>
+        <w:fldChar w:fldCharType="end"/>
+      </w:r>
+      <w:r>
+        <w:rPr>
+          <w:rFonts w:ascii="Arial" w:hAnsi="Arial" w:cs="Arial"/>
+          <w:sz w:val="20"/>
+        </w:rPr>
+        <w:t>. Aspectos evaluados para identificar las brechas del programa según los pilares del Modelo CMO.</w:t>
+      </w:r>
+    </w:p>
     <w:p>
       <w:pPr>
         <w:pStyle w:val="Ttulo2"/>
@@ -4598,22 +4592,56 @@
       </w:r>
     </w:p>
     <w:p>
-      <w:r>
+      <w:proofErr w:type="spellStart"/>
+      <w:proofErr w:type="spellEnd"/>
+      <w:r>
+        <w:rPr>
+          <w:rFonts w:ascii="Arial" w:hAnsi="Arial" w:cs="Arial"/>
+          <w:sz w:val="20"/>
+        </w:rPr>
         <w:t xml:space="preserve">Figura </w:t>
       </w:r>
       <w:r>
+        <w:rPr>
+          <w:rFonts w:ascii="Arial" w:hAnsi="Arial" w:cs="Arial"/>
+          <w:sz w:val="20"/>
+        </w:rPr>
+        <w:fldChar w:fldCharType="begin"/>
+      </w:r>
+      <w:r>
+        <w:rPr>
+          <w:rFonts w:ascii="Arial" w:hAnsi="Arial" w:cs="Arial"/>
+          <w:sz w:val="20"/>
+        </w:rPr>
+        <w:instrText xml:space="preserve"> SEQ Figura \* ARABIC </w:instrText>
+      </w:r>
+      <w:r>
+        <w:rPr>
+          <w:rFonts w:ascii="Arial" w:hAnsi="Arial" w:cs="Arial"/>
+          <w:sz w:val="20"/>
+        </w:rPr>
+        <w:fldChar w:fldCharType="separate"/>
+      </w:r>
+      <w:r>
+        <w:rPr>
+          <w:rFonts w:ascii="Arial" w:hAnsi="Arial" w:cs="Arial"/>
+          <w:sz w:val="20"/>
+        </w:rPr>
         <w:t>1</w:t>
       </w:r>
       <w:r>
-        <w:t xml:space="preserve">. Flujograma de priorización e intervención farmacéutica domiciliaria según el Modelo CMO, CESFAM Villa </w:t>
-      </w:r>
-      <w:proofErr w:type="spellStart"/>
-      <w:r>
-        <w:t>Nonguén</w:t>
-      </w:r>
-      <w:proofErr w:type="spellEnd"/>
-      <w:r>
-        <w:t>. Elaboración propia.</w:t>
+        <w:rPr>
+          <w:rFonts w:ascii="Arial" w:hAnsi="Arial" w:cs="Arial"/>
+          <w:sz w:val="20"/>
+        </w:rPr>
+        <w:fldChar w:fldCharType="end"/>
+      </w:r>
+      <w:r>
+        <w:rPr>
+          <w:rFonts w:ascii="Arial" w:hAnsi="Arial" w:cs="Arial"/>
+          <w:sz w:val="20"/>
+        </w:rPr>
+        <w:t>. Flujograma de priorización e intervención farmacéutica domiciliaria según el Modelo CMO, CESFAM Villa Nonguén. Elaboración propia.</w:t>
       </w:r>
     </w:p>
     <w:p>
@@ -4679,28 +4707,56 @@
       </w:r>
     </w:p>
     <w:p>
-      <w:r>
+      <w:proofErr w:type="spellStart"/>
+      <w:proofErr w:type="spellEnd"/>
+      <w:r>
+        <w:rPr>
+          <w:rFonts w:ascii="Arial" w:hAnsi="Arial" w:cs="Arial"/>
+          <w:sz w:val="20"/>
+        </w:rPr>
         <w:t xml:space="preserve">Figura </w:t>
       </w:r>
       <w:r>
+        <w:rPr>
+          <w:rFonts w:ascii="Arial" w:hAnsi="Arial" w:cs="Arial"/>
+          <w:sz w:val="20"/>
+        </w:rPr>
+        <w:fldChar w:fldCharType="begin"/>
+      </w:r>
+      <w:r>
+        <w:rPr>
+          <w:rFonts w:ascii="Arial" w:hAnsi="Arial" w:cs="Arial"/>
+          <w:sz w:val="20"/>
+        </w:rPr>
+        <w:instrText xml:space="preserve"> SEQ Figura \* ARABIC </w:instrText>
+      </w:r>
+      <w:r>
+        <w:rPr>
+          <w:rFonts w:ascii="Arial" w:hAnsi="Arial" w:cs="Arial"/>
+          <w:sz w:val="20"/>
+        </w:rPr>
+        <w:fldChar w:fldCharType="separate"/>
+      </w:r>
+      <w:r>
+        <w:rPr>
+          <w:rFonts w:ascii="Arial" w:hAnsi="Arial" w:cs="Arial"/>
+          <w:sz w:val="20"/>
+        </w:rPr>
         <w:t>2</w:t>
       </w:r>
       <w:r>
-        <w:t xml:space="preserve">. </w:t>
-      </w:r>
-      <w:r>
-        <w:t>Priorización</w:t>
-      </w:r>
-      <w:r>
-        <w:t xml:space="preserve"> de la derivación y asignación del tipo de visita domiciliaria según el Modelo CMO, CESFAM Villa </w:t>
-      </w:r>
-      <w:proofErr w:type="spellStart"/>
-      <w:r>
-        <w:t>Nonguén</w:t>
-      </w:r>
-      <w:proofErr w:type="spellEnd"/>
-      <w:r>
-        <w:t>. Elaboración propia.</w:t>
+        <w:rPr>
+          <w:rFonts w:ascii="Arial" w:hAnsi="Arial" w:cs="Arial"/>
+          <w:sz w:val="20"/>
+        </w:rPr>
+        <w:fldChar w:fldCharType="end"/>
+      </w:r>
+      <w:r>
+        <w:rPr>
+          <w:rFonts w:ascii="Arial" w:hAnsi="Arial" w:cs="Arial"/>
+          <w:sz w:val="20"/>
+        </w:rPr>
+        <w:t>. Priorización de la derivación y asignación del tipo de visita domiciliaria según el Modelo CMO, CESFAM Villa Nonguén. Elaboración propia.</w:t>
       </w:r>
     </w:p>
     <w:p>
@@ -4756,22 +4812,56 @@
       </w:r>
     </w:p>
     <w:p>
-      <w:r>
+      <w:proofErr w:type="spellStart"/>
+      <w:proofErr w:type="spellEnd"/>
+      <w:r>
+        <w:rPr>
+          <w:rFonts w:ascii="Arial" w:hAnsi="Arial" w:cs="Arial"/>
+          <w:sz w:val="20"/>
+        </w:rPr>
         <w:t xml:space="preserve">Figura </w:t>
       </w:r>
       <w:r>
+        <w:rPr>
+          <w:rFonts w:ascii="Arial" w:hAnsi="Arial" w:cs="Arial"/>
+          <w:sz w:val="20"/>
+        </w:rPr>
+        <w:fldChar w:fldCharType="begin"/>
+      </w:r>
+      <w:r>
+        <w:rPr>
+          <w:rFonts w:ascii="Arial" w:hAnsi="Arial" w:cs="Arial"/>
+          <w:sz w:val="20"/>
+        </w:rPr>
+        <w:instrText xml:space="preserve"> SEQ Figura \* ARABIC </w:instrText>
+      </w:r>
+      <w:r>
+        <w:rPr>
+          <w:rFonts w:ascii="Arial" w:hAnsi="Arial" w:cs="Arial"/>
+          <w:sz w:val="20"/>
+        </w:rPr>
+        <w:fldChar w:fldCharType="separate"/>
+      </w:r>
+      <w:r>
+        <w:rPr>
+          <w:rFonts w:ascii="Arial" w:hAnsi="Arial" w:cs="Arial"/>
+          <w:sz w:val="20"/>
+        </w:rPr>
         <w:t>3</w:t>
       </w:r>
       <w:r>
-        <w:t xml:space="preserve">. Flujograma de la visita domiciliaria puntual de revisión de la medicación según el Modelo CMO, CESFAM Villa </w:t>
-      </w:r>
-      <w:proofErr w:type="spellStart"/>
-      <w:r>
-        <w:t>Nonguén</w:t>
-      </w:r>
-      <w:proofErr w:type="spellEnd"/>
-      <w:r>
-        <w:t>. Elaboración propia.</w:t>
+        <w:rPr>
+          <w:rFonts w:ascii="Arial" w:hAnsi="Arial" w:cs="Arial"/>
+          <w:sz w:val="20"/>
+        </w:rPr>
+        <w:fldChar w:fldCharType="end"/>
+      </w:r>
+      <w:r>
+        <w:rPr>
+          <w:rFonts w:ascii="Arial" w:hAnsi="Arial" w:cs="Arial"/>
+          <w:sz w:val="20"/>
+        </w:rPr>
+        <w:t>. Flujograma de la visita domiciliaria puntual de revisión de la medicación según el Modelo CMO, CESFAM Villa Nonguén. Elaboración propia.</w:t>
       </w:r>
     </w:p>
     <w:p>
@@ -5601,35 +5691,6 @@
       </w:r>
       <w:bookmarkEnd w:id="36"/>
       <w:bookmarkEnd w:id="37"/>
-    </w:p>
-    <w:p>
-      <w:pPr>
-        <w:rPr>
-          <w:b/>
-          <w:bCs/>
-        </w:rPr>
-      </w:pPr>
-      <w:r>
-        <w:rPr>
-          <w:b/>
-          <w:bCs/>
-        </w:rPr>
-        <w:t xml:space="preserve">Tabla </w:t>
-      </w:r>
-      <w:r>
-        <w:rPr>
-          <w:b/>
-          <w:bCs/>
-        </w:rPr>
-        <w:t>1</w:t>
-      </w:r>
-      <w:r>
-        <w:rPr>
-          <w:b/>
-          <w:bCs/>
-        </w:rPr>
-        <w:t>. Preguntas del test de Morisky-Green-Levine.</w:t>
-      </w:r>
     </w:p>
     <w:tbl>
       <w:tblPr>
@@ -5869,6 +5930,63 @@
     </w:tbl>
     <w:p>
       <w:pPr>
+        <w:rPr>
+          <w:b/>
+          <w:bCs/>
+        </w:rPr>
+      </w:pPr>
+      <w:r>
+        <w:rPr>
+          <w:rFonts w:ascii="Arial" w:hAnsi="Arial" w:cs="Arial"/>
+          <w:sz w:val="20"/>
+        </w:rPr>
+        <w:t xml:space="preserve">Tabla </w:t>
+      </w:r>
+      <w:r>
+        <w:rPr>
+          <w:rFonts w:ascii="Arial" w:hAnsi="Arial" w:cs="Arial"/>
+          <w:sz w:val="20"/>
+        </w:rPr>
+        <w:fldChar w:fldCharType="begin"/>
+      </w:r>
+      <w:r>
+        <w:rPr>
+          <w:rFonts w:ascii="Arial" w:hAnsi="Arial" w:cs="Arial"/>
+          <w:sz w:val="20"/>
+        </w:rPr>
+        <w:instrText xml:space="preserve"> SEQ Tabla \* ARABIC </w:instrText>
+      </w:r>
+      <w:r>
+        <w:rPr>
+          <w:rFonts w:ascii="Arial" w:hAnsi="Arial" w:cs="Arial"/>
+          <w:sz w:val="20"/>
+        </w:rPr>
+        <w:fldChar w:fldCharType="separate"/>
+      </w:r>
+      <w:r>
+        <w:rPr>
+          <w:rFonts w:ascii="Arial" w:hAnsi="Arial" w:cs="Arial"/>
+          <w:sz w:val="20"/>
+        </w:rPr>
+        <w:t>2</w:t>
+      </w:r>
+      <w:r>
+        <w:rPr>
+          <w:rFonts w:ascii="Arial" w:hAnsi="Arial" w:cs="Arial"/>
+          <w:sz w:val="20"/>
+        </w:rPr>
+        <w:fldChar w:fldCharType="end"/>
+      </w:r>
+      <w:r>
+        <w:rPr>
+          <w:rFonts w:ascii="Arial" w:hAnsi="Arial" w:cs="Arial"/>
+          <w:sz w:val="20"/>
+        </w:rPr>
+        <w:t>. Preguntas del test de Morisky-Green-Levine.</w:t>
+      </w:r>
+    </w:p>
+    <w:p>
+      <w:pPr>
         <w:spacing w:after="120" w:line="360" w:lineRule="auto"/>
         <w:jc w:val="both"/>
       </w:pPr>
@@ -6057,17 +6175,6 @@
       </w:r>
       <w:bookmarkEnd w:id="44"/>
       <w:bookmarkEnd w:id="45"/>
-    </w:p>
-    <w:p>
-      <w:r>
-        <w:t xml:space="preserve">Tabla </w:t>
-      </w:r>
-      <w:r>
-        <w:t>1</w:t>
-      </w:r>
-      <w:r>
-        <w:t>. Clasificación de los resultados negativos asociados a la medicación según el Consenso de Granada.</w:t>
-      </w:r>
     </w:p>
     <w:tbl>
       <w:tblPr>
@@ -6261,6 +6368,57 @@
         </w:tc>
       </w:tr>
     </w:tbl>
+    <w:p>
+      <w:r>
+        <w:rPr>
+          <w:rFonts w:ascii="Arial" w:hAnsi="Arial" w:cs="Arial"/>
+          <w:sz w:val="20"/>
+        </w:rPr>
+        <w:t xml:space="preserve">Tabla </w:t>
+      </w:r>
+      <w:r>
+        <w:rPr>
+          <w:rFonts w:ascii="Arial" w:hAnsi="Arial" w:cs="Arial"/>
+          <w:sz w:val="20"/>
+        </w:rPr>
+        <w:fldChar w:fldCharType="begin"/>
+      </w:r>
+      <w:r>
+        <w:rPr>
+          <w:rFonts w:ascii="Arial" w:hAnsi="Arial" w:cs="Arial"/>
+          <w:sz w:val="20"/>
+        </w:rPr>
+        <w:instrText xml:space="preserve"> SEQ Tabla \* ARABIC </w:instrText>
+      </w:r>
+      <w:r>
+        <w:rPr>
+          <w:rFonts w:ascii="Arial" w:hAnsi="Arial" w:cs="Arial"/>
+          <w:sz w:val="20"/>
+        </w:rPr>
+        <w:fldChar w:fldCharType="separate"/>
+      </w:r>
+      <w:r>
+        <w:rPr>
+          <w:rFonts w:ascii="Arial" w:hAnsi="Arial" w:cs="Arial"/>
+          <w:sz w:val="20"/>
+        </w:rPr>
+        <w:t>3</w:t>
+      </w:r>
+      <w:r>
+        <w:rPr>
+          <w:rFonts w:ascii="Arial" w:hAnsi="Arial" w:cs="Arial"/>
+          <w:sz w:val="20"/>
+        </w:rPr>
+        <w:fldChar w:fldCharType="end"/>
+      </w:r>
+      <w:r>
+        <w:rPr>
+          <w:rFonts w:ascii="Arial" w:hAnsi="Arial" w:cs="Arial"/>
+          <w:sz w:val="20"/>
+        </w:rPr>
+        <w:t>. Clasificación de los resultados negativos asociados a la medicación según el Consenso de Granada.</w:t>
+      </w:r>
+    </w:p>
     <w:p>
       <w:pPr>
         <w:pStyle w:val="Ttulo2"/>

</xml_diff>

<commit_message>
Reescribe parrafo de examenes: enfatiza interpretacion de parametros, no registro de datos
</commit_message>
<xml_diff>
--- a/Tesis AVANCE 1 - Rev DJP (3).docx
+++ b/Tesis AVANCE 1 - Rev DJP (3).docx
@@ -4882,16 +4882,14 @@
         <w:spacing w:after="120" w:line="360" w:lineRule="auto"/>
         <w:jc w:val="both"/>
       </w:pPr>
-      <w:r>
-        <w:t xml:space="preserve">Como parte del diseño del protocolo se seleccionaron y adaptaron herramientas sencillas, compatibles con la rutina del CESFAM. La adherencia se evalúa con el test de Morisky-Green-Levine de cuatro preguntas (Morisky, Green &amp; Levine, 1986; </w:t>
-      </w:r>
       <w:proofErr w:type="spellStart"/>
-      <w:r>
-        <w:t>Beyhaghi</w:t>
-      </w:r>
       <w:proofErr w:type="spellEnd"/>
       <w:r>
-        <w:t xml:space="preserve"> et al., 2016), incluido en el Anexo 2, que en algunos casos se complementa con el test de Batalla, el cual permite conocer el grado de conocimiento que el paciente tiene sobre su enfermedad (Batalla et al., 1984). Cuando están disponibles en la ficha clínica, se consideran los exámenes de laboratorio del paciente, como el hemograma, el perfil lipídico, la glucosa, la creatinina, la velocidad de filtración glomerular, la hemoglobina glicosilada o las pruebas tiroideas (TSH y T4 libre). Durante la visita domiciliaria esta información se complementa con la medición de la presión arterial y la frecuencia cardíaca mediante un tensiómetro de brazo, práctica ya habitual que permite estimar el grado de compensación del paciente en el momento.</w:t>
+        <w:rPr>
+          <w:rFonts w:ascii="Arial" w:hAnsi="Arial" w:cs="Arial"/>
+          <w:sz w:val="24"/>
+        </w:rPr>
+        <w:t>Como parte del diseño del protocolo se seleccionaron y adaptaron herramientas sencillas, compatibles con la rutina del CESFAM. La adherencia se evalúa con el test de Morisky-Green-Levine de cuatro preguntas (Morisky, Green &amp; Levine, 1986; Beyhaghi et al., 2016), incluido en el Anexo 2, que en algunos casos se complementa con el test de Batalla, el cual permite conocer el grado de conocimiento que el paciente tiene sobre su enfermedad (Batalla et al., 1984). El protocolo contempla además la interpretación de los parámetros de laboratorio a los que el equipo accede en la ficha clínica, como el perfil lipídico, la glucosa, la hemoglobina glicosilada o la velocidad de filtración glomerular, ya que leer e interpretar esos valores forma parte de las competencias del químico farmacéutico y le permite orientar mejor la atención, anticipar los problemas relacionados con los medicamentos y reforzar la adherencia. La idea no es registrar ni almacenar información de los pacientes, ya que esa lectura clínica se realiza dentro de la farmacia y se aprovecha, junto con herramientas como el método Dáder y los pilares del Modelo CMO, para decidir cómo abordar cada caso. Durante la visita domiciliaria esta información se complementa con la medición de la presión arterial y la frecuencia cardíaca mediante un tensiómetro de brazo, práctica ya habitual que permite estimar el grado de compensación del paciente en el momento.</w:t>
       </w:r>
     </w:p>
     <w:p>

</xml_diff>

<commit_message>
Borra primer parrafo de metodologia, quita todos los resaltados y actualiza Anexo 3 (antecedentes clinicos relevantes)
</commit_message>
<xml_diff>
--- a/Tesis AVANCE 1 - Rev DJP (3).docx
+++ b/Tesis AVANCE 1 - Rev DJP (3).docx
@@ -4086,21 +4086,6 @@
       <w:pPr>
         <w:spacing w:after="120" w:line="360" w:lineRule="auto"/>
         <w:jc w:val="both"/>
-        <w:rPr>
-          <w:strike/>
-        </w:rPr>
-      </w:pPr>
-      <w:r>
-        <w:rPr>
-          <w:highlight w:val="red"/>
-        </w:rPr>
-        <w:t>Esta memoria comprende un trabajo de desarrollo metodológico: no se hizo un experimento ni se recogieron datos clínicos de pacientes, sino que se diseñó un protocolo a partir de la revisión de la literatura, del análisis de la normativa del Ministerio de Salud y de la adaptación de herramientas que ya se usan en la Atención Primaria. El diseño se ajustó a lo que se observó en el propio centro, para que resultara pertinente en la realidad del CESFAM.</w:t>
-      </w:r>
-    </w:p>
-    <w:p>
-      <w:pPr>
-        <w:spacing w:after="120" w:line="360" w:lineRule="auto"/>
-        <w:jc w:val="both"/>
       </w:pPr>
       <w:r>
         <w:t xml:space="preserve">El trabajo se desarrolló en el CESFAM Villa </w:t>
@@ -4194,13 +4179,11 @@
               <w:rPr>
                 <w:b/>
                 <w:bCs/>
-                <w:highlight w:val="red"/>
               </w:rPr>
             </w:pPr>
             <w:r>
               <w:rPr>
                 <w:b/>
-                <w:highlight w:val="red"/>
               </w:rPr>
               <w:t>Pilar del Modelo CMO</w:t>
             </w:r>
@@ -4215,13 +4198,11 @@
               <w:rPr>
                 <w:b/>
                 <w:bCs/>
-                <w:highlight w:val="red"/>
               </w:rPr>
             </w:pPr>
             <w:r>
               <w:rPr>
                 <w:b/>
-                <w:highlight w:val="red"/>
               </w:rPr>
               <w:t>Aspecto evaluado</w:t>
             </w:r>
@@ -4236,13 +4217,11 @@
               <w:rPr>
                 <w:b/>
                 <w:bCs/>
-                <w:highlight w:val="red"/>
               </w:rPr>
             </w:pPr>
             <w:r>
               <w:rPr>
                 <w:b/>
-                <w:highlight w:val="red"/>
               </w:rPr>
               <w:t>Referencia para la comparación</w:t>
             </w:r>
@@ -4259,14 +4238,10 @@
           </w:tcPr>
           <w:p>
             <w:pPr>
-              <w:rPr>
-                <w:highlight w:val="red"/>
-              </w:rPr>
+              <w:rPr/>
             </w:pPr>
             <w:r>
-              <w:rPr>
-                <w:highlight w:val="red"/>
-              </w:rPr>
+              <w:rPr/>
               <w:t>Capacidad</w:t>
             </w:r>
           </w:p>
@@ -4277,14 +4252,10 @@
           </w:tcPr>
           <w:p>
             <w:pPr>
-              <w:rPr>
-                <w:highlight w:val="red"/>
-              </w:rPr>
+              <w:rPr/>
             </w:pPr>
             <w:r>
-              <w:rPr>
-                <w:highlight w:val="red"/>
-              </w:rPr>
+              <w:rPr/>
               <w:t>Criterios de priorización e ingreso a la visita domiciliaria</w:t>
             </w:r>
           </w:p>
@@ -4295,14 +4266,10 @@
           </w:tcPr>
           <w:p>
             <w:pPr>
-              <w:rPr>
-                <w:highlight w:val="red"/>
-              </w:rPr>
+              <w:rPr/>
             </w:pPr>
             <w:r>
-              <w:rPr>
-                <w:highlight w:val="red"/>
-              </w:rPr>
+              <w:rPr/>
               <w:t>Orientación Técnica del Programa de Salud Cardiovascular y del Fondo de Farmacia (MINSAL); pilar de Capacidad del Modelo CMO</w:t>
             </w:r>
           </w:p>
@@ -4318,14 +4285,10 @@
           </w:tcPr>
           <w:p>
             <w:pPr>
-              <w:rPr>
-                <w:highlight w:val="red"/>
-              </w:rPr>
+              <w:rPr/>
             </w:pPr>
             <w:r>
-              <w:rPr>
-                <w:highlight w:val="red"/>
-              </w:rPr>
+              <w:rPr/>
               <w:t>Motivación</w:t>
             </w:r>
           </w:p>
@@ -4336,14 +4299,10 @@
           </w:tcPr>
           <w:p>
             <w:pPr>
-              <w:rPr>
-                <w:highlight w:val="red"/>
-              </w:rPr>
+              <w:rPr/>
             </w:pPr>
             <w:r>
-              <w:rPr>
-                <w:highlight w:val="red"/>
-              </w:rPr>
+              <w:rPr/>
               <w:t>Abordaje de la adherencia y de las barreras del paciente</w:t>
             </w:r>
           </w:p>
@@ -4354,14 +4313,10 @@
           </w:tcPr>
           <w:p>
             <w:pPr>
-              <w:rPr>
-                <w:highlight w:val="red"/>
-              </w:rPr>
+              <w:rPr/>
             </w:pPr>
             <w:r>
-              <w:rPr>
-                <w:highlight w:val="red"/>
-              </w:rPr>
+              <w:rPr/>
               <w:t>Guía de Atención Farmacéutica y Seguimiento Farmacoterapéutico en APS (MINSAL); pilar de Motivación</w:t>
             </w:r>
           </w:p>
@@ -4377,14 +4332,10 @@
           </w:tcPr>
           <w:p>
             <w:pPr>
-              <w:rPr>
-                <w:highlight w:val="red"/>
-              </w:rPr>
+              <w:rPr/>
             </w:pPr>
             <w:r>
-              <w:rPr>
-                <w:highlight w:val="red"/>
-              </w:rPr>
+              <w:rPr/>
               <w:t>Oportunidad</w:t>
             </w:r>
           </w:p>
@@ -4395,14 +4346,10 @@
           </w:tcPr>
           <w:p>
             <w:pPr>
-              <w:rPr>
-                <w:highlight w:val="red"/>
-              </w:rPr>
+              <w:rPr/>
             </w:pPr>
             <w:r>
-              <w:rPr>
-                <w:highlight w:val="red"/>
-              </w:rPr>
+              <w:rPr/>
               <w:t>Registro de la atención y continuidad del seguimiento</w:t>
             </w:r>
           </w:p>
@@ -4413,9 +4360,7 @@
           </w:tcPr>
           <w:p>
             <w:r>
-              <w:rPr>
-                <w:highlight w:val="red"/>
-              </w:rPr>
+              <w:rPr/>
               <w:t>Ficha clínica institucional; pilar de Oportunidad; evaluación previa del programa (Faúndez Navarrete, 2020)</w:t>
             </w:r>
           </w:p>
@@ -6020,7 +5965,11 @@
         <w:jc w:val="both"/>
       </w:pPr>
       <w:r>
-        <w:t>•  Datos generales, problemas de salud y exámenes disponibles.</w:t>
+        <w:rPr>
+          <w:rFonts w:ascii="Arial" w:hAnsi="Arial" w:cs="Arial"/>
+          <w:sz w:val="24"/>
+        </w:rPr>
+        <w:t>•  Datos generales, problemas de salud y antecedentes clínicos relevantes.</w:t>
       </w:r>
     </w:p>
     <w:p>

</xml_diff>

<commit_message>
Fusiona subtitulos similares del Capitulo I (13 -> 11 secciones), renumera; mantiene titulos de capitulo
</commit_message>
<xml_diff>
--- a/Tesis AVANCE 1 - Rev DJP (3).docx
+++ b/Tesis AVANCE 1 - Rev DJP (3).docx
@@ -3599,7 +3599,7 @@
       </w:pPr>
       <w:bookmarkStart w:id="6" w:name="_Toc235014854"/>
       <w:r>
-        <w:t>1.3 Atención Farmacéutica</w:t>
+        <w:t>1.3 Atención Farmacéutica y rol del Químico Farmacéutico</w:t>
       </w:r>
       <w:bookmarkEnd w:id="6"/>
     </w:p>
@@ -3618,30 +3618,20 @@
     </w:p>
     <w:p>
       <w:pPr>
+        <w:spacing w:after="120" w:line="360" w:lineRule="auto"/>
+        <w:jc w:val="both"/>
+      </w:pPr>
+      <w:r>
+        <w:t>En la Atención Primaria chilena la incorporación del Químico Farmacéutico a los equipos ha sido un avance, pero todavía falta un método claro y compartido para guiar y evaluar su trabajo clínico en el domicilio. Sin ese método, cada profesional organiza la visita de acuerdo con su criterio, los resultados se vuelven difíciles de comparar y el aporte del farmacéutico queda poco visible para el resto del equipo.</w:t>
+      </w:r>
+    </w:p>
+    <w:p>
+      <w:pPr>
         <w:pStyle w:val="Ttulo2"/>
       </w:pPr>
-      <w:bookmarkStart w:id="7" w:name="_Toc235014855"/>
-      <w:r>
-        <w:t>1.4 Rol del Químico Farmacéutico en la Atención Primaria</w:t>
-      </w:r>
-      <w:bookmarkEnd w:id="7"/>
-    </w:p>
-    <w:p>
-      <w:pPr>
-        <w:spacing w:after="120" w:line="360" w:lineRule="auto"/>
-        <w:jc w:val="both"/>
-      </w:pPr>
-      <w:r>
-        <w:t>En la Atención Primaria chilena la incorporación del Químico Farmacéutico a los equipos ha sido un avance, pero todavía falta un método claro y compartido para guiar y evaluar su trabajo clínico en el domicilio. Sin ese método, cada profesional organiza la visita de acuerdo con su criterio, los resultados se vuelven difíciles de comparar y el aporte del farmacéutico queda poco visible para el resto del equipo.</w:t>
-      </w:r>
-    </w:p>
-    <w:p>
-      <w:pPr>
-        <w:pStyle w:val="Ttulo2"/>
-      </w:pPr>
       <w:bookmarkStart w:id="8" w:name="_Toc235014856"/>
       <w:r>
-        <w:t>1.5 Atención Farmacéutica domiciliaria</w:t>
+        <w:t>1.4 Atención Farmacéutica domiciliaria</w:t>
       </w:r>
       <w:bookmarkEnd w:id="8"/>
     </w:p>
@@ -3688,7 +3678,7 @@
       </w:pPr>
       <w:bookmarkStart w:id="9" w:name="_Toc235014857"/>
       <w:r>
-        <w:t>1.6 Adherencia, polifarmacia y problemas relacionados con los medicamentos</w:t>
+        <w:t>1.5 Adherencia, polifarmacia y seguimiento farmacoterapéutico</w:t>
       </w:r>
       <w:bookmarkEnd w:id="9"/>
     </w:p>
@@ -3717,16 +3707,6 @@
       <w:r>
         <w:t>La dificultad es mayor en los pacientes que toman muchos medicamentos, tienen problemas sociales o presentan condiciones propias de la edad, en quienes la adherencia es más frágil (Maher, Hanlon &amp; Hajjar, 2014; Manzano García &amp; Morillo Verdugo, 2018).</w:t>
       </w:r>
-    </w:p>
-    <w:p>
-      <w:pPr>
-        <w:pStyle w:val="Ttulo2"/>
-      </w:pPr>
-      <w:bookmarkStart w:id="10" w:name="_Toc235014858"/>
-      <w:r>
-        <w:t>1.7 Métodos de seguimiento farmacoterapéutico</w:t>
-      </w:r>
-      <w:bookmarkEnd w:id="10"/>
     </w:p>
     <w:p>
       <w:pPr>
@@ -3763,7 +3743,7 @@
       </w:pPr>
       <w:bookmarkStart w:id="11" w:name="_Toc235014859"/>
       <w:r>
-        <w:t>1.8 Modelo CMO</w:t>
+        <w:t>1.6 Modelo CMO</w:t>
       </w:r>
       <w:bookmarkEnd w:id="11"/>
     </w:p>
@@ -3791,13 +3771,9 @@
       </w:pPr>
       <w:bookmarkStart w:id="12" w:name="_Toc235014860"/>
       <w:r>
-        <w:lastRenderedPageBreak/>
-        <w:t xml:space="preserve">1.9 Diseño del protocolo bajo el Modelo CMO en el CESFAM Villa </w:t>
+        <w:t>1.7 Diseño del protocolo bajo el Modelo CMO en el CESFAM Villa Nonguén</w:t>
       </w:r>
       <w:proofErr w:type="spellStart"/>
-      <w:r>
-        <w:t>Nonguén</w:t>
-      </w:r>
       <w:bookmarkEnd w:id="12"/>
       <w:proofErr w:type="spellEnd"/>
     </w:p>
@@ -3882,7 +3858,7 @@
       </w:pPr>
       <w:bookmarkStart w:id="13" w:name="_Toc235014861"/>
       <w:r>
-        <w:t>1.10 Justificación y planteamiento del problema</w:t>
+        <w:t>1.8 Justificación y planteamiento del problema</w:t>
       </w:r>
       <w:bookmarkEnd w:id="13"/>
     </w:p>
@@ -3923,7 +3899,7 @@
       </w:pPr>
       <w:bookmarkStart w:id="14" w:name="_Toc235014862"/>
       <w:r>
-        <w:t>1.11 Delimitación del problema</w:t>
+        <w:t>1.9 Delimitación del problema</w:t>
       </w:r>
       <w:bookmarkEnd w:id="14"/>
     </w:p>
@@ -3952,7 +3928,7 @@
       <w:bookmarkStart w:id="16" w:name="_Toc235014863"/>
       <w:bookmarkEnd w:id="15"/>
       <w:r>
-        <w:t>1.12 Pregunta de investigación</w:t>
+        <w:t>1.10 Pregunta de investigación</w:t>
       </w:r>
       <w:bookmarkEnd w:id="16"/>
     </w:p>
@@ -3979,8 +3955,7 @@
       </w:pPr>
       <w:bookmarkStart w:id="17" w:name="_Toc235014864"/>
       <w:r>
-        <w:lastRenderedPageBreak/>
-        <w:t>1.13 Objetivos</w:t>
+        <w:t>1.11 Objetivos</w:t>
       </w:r>
       <w:bookmarkEnd w:id="17"/>
     </w:p>

</xml_diff>

<commit_message>
Reordena Capitulo I: Modelo CMO antes de Atencion Farmaceutica domiciliaria (coherencia macro a micro); ajusta frase de enlace
</commit_message>
<xml_diff>
--- a/Tesis AVANCE 1 - Rev DJP (3).docx
+++ b/Tesis AVANCE 1 - Rev DJP (3).docx
@@ -3629,9 +3629,102 @@
       <w:pPr>
         <w:pStyle w:val="Ttulo2"/>
       </w:pPr>
+      <w:bookmarkStart w:id="9" w:name="_Toc235014857"/>
+      <w:r>
+        <w:t xml:space="preserve">1.4 Adherencia, polifarmacia y seguimiento farmacoterapéutico</w:t>
+      </w:r>
+      <w:bookmarkEnd w:id="9"/>
+    </w:p>
+    <w:p>
+      <w:pPr>
+        <w:spacing w:after="120" w:line="360" w:lineRule="auto"/>
+        <w:jc w:val="both"/>
+      </w:pPr>
+      <w:r>
+        <w:t xml:space="preserve">Que un tratamiento esté indicado no asegura que el paciente lo tome como corresponde. La adherencia, entendida como el grado en que la persona sigue las indicaciones acordadas con el equipo de salud, es uno de los factores que más influye en el control de estas enfermedades y suele ser baja en quienes usan varios medicamentos a la vez (Haynes et al., 1979; Cutler &amp; Everett, 2010; Martín Alfonso, 2004; Morales &amp; Estela, 2015; Abegaz et al., 2017; </w:t>
+      </w:r>
+      <w:proofErr w:type="spellStart"/>
+      <w:r>
+        <w:t>Kolandaivelu</w:t>
+      </w:r>
+      <w:proofErr w:type="spellEnd"/>
+      <w:r>
+        <w:t xml:space="preserve"> et al., 2014). En los usuarios que además dependen de otros o tienen dificultades para llegar al centro, la visita domiciliaria pasa a ser la mejor oportunidad para revisar la terapia, resolver dudas y reforzar la adherencia.</w:t>
+      </w:r>
+    </w:p>
+    <w:p>
+      <w:pPr>
+        <w:spacing w:after="120" w:line="360" w:lineRule="auto"/>
+        <w:jc w:val="both"/>
+      </w:pPr>
+      <w:r>
+        <w:t>La dificultad es mayor en los pacientes que toman muchos medicamentos, tienen problemas sociales o presentan condiciones propias de la edad, en quienes la adherencia es más frágil (Maher, Hanlon &amp; Hajjar, 2014; Manzano García &amp; Morillo Verdugo, 2018).</w:t>
+      </w:r>
+    </w:p>
+    <w:p>
+      <w:pPr>
+        <w:spacing w:after="120" w:line="360" w:lineRule="auto"/>
+        <w:jc w:val="both"/>
+      </w:pPr>
+      <w:r>
+        <w:t xml:space="preserve">La forma de realizar una Atención Farmacéutica ha cambiado bastante en las últimas décadas. Al comienzo el trabajo giraba en torno al medicamento y al control del gasto, con poca estructura (Calleja Hernández &amp; Morillo Verdugo, 2016). A medida que la </w:t>
+      </w:r>
+      <w:r>
+        <w:lastRenderedPageBreak/>
+        <w:t xml:space="preserve">población envejeció y aparecieron más pacientes con varias enfermedades a la vez, ese enfoque resultó insuficiente. Para ordenar el seguimiento surgieron métodos como el </w:t>
+      </w:r>
+      <w:proofErr w:type="spellStart"/>
+      <w:r>
+        <w:t>Dáder</w:t>
+      </w:r>
+      <w:proofErr w:type="spellEnd"/>
+      <w:r>
+        <w:t xml:space="preserve"> y, en Chile, el POLARIS, que ofrecen una manera sistemática de detectar los problemas relacionados con los medicamentos (PRM) y los resultados negativos asociados a la medicación (RNM) (</w:t>
+      </w:r>
+      <w:proofErr w:type="spellStart"/>
+      <w:r>
+        <w:t>Faus</w:t>
+      </w:r>
+      <w:proofErr w:type="spellEnd"/>
+      <w:r>
+        <w:t xml:space="preserve"> Dáder, 2018; Plaza, 2018; Ministerio de Salud de Chile, 2018a, 2019). Para clasificar estos problemas se suele recurrir al Tercer Consenso de Granada, que ordena los RNM según, si el tratamiento es necesario, efectivo y seguro (Comité de Consenso de Granada, 2007). Estos métodos expuestos aportaron rigor, aunque llevarlos por completo a la Atención Primaria ha sido difícil, sobre todo en la parte conductual y en la logística de la visita a domicilio.</w:t>
+      </w:r>
+    </w:p>
+    <w:p>
+      <w:pPr>
+        <w:pStyle w:val="Ttulo2"/>
+      </w:pPr>
+      <w:bookmarkStart w:id="11" w:name="_Toc235014859"/>
+      <w:r>
+        <w:t xml:space="preserve">1.5 Modelo CMO</w:t>
+      </w:r>
+      <w:bookmarkEnd w:id="11"/>
+    </w:p>
+    <w:p>
+      <w:pPr>
+        <w:spacing w:after="120" w:line="360" w:lineRule="auto"/>
+        <w:jc w:val="both"/>
+      </w:pPr>
+      <w:r>
+        <w:t>Sobre esa base, el marco que hoy se usa como referencia para modernizar la Atención Farmacéutica es el Modelo CMO Capacidad, Motivación y Oportunidad, desarrollado en España y validado por su sociedad de farmacia hospitalaria (Calleja Hernández &amp; Morillo Verdugo, 2016). Su valor está en ordenar la atención en torno a tres ideas sencillas que se pueden llevar al domicilio del paciente; además, investigaciones recientes han aplicado este modelo en patologías de alta complejidad, como las coagulopatías congénitas (Juárez Giménez &amp; Morillo Verdugo, 2026), evidenciando su versatilidad clínica y su capacidad de adaptación a distintos contextos sociosanitarios.</w:t>
+      </w:r>
+    </w:p>
+    <w:p>
+      <w:pPr>
+        <w:spacing w:after="120" w:line="360" w:lineRule="auto"/>
+        <w:jc w:val="both"/>
+      </w:pPr>
+      <w:r>
+        <w:t>La Capacidad tiene directa relación con priorizar, en lugar de atender a todos por igual, propone concentrar el tiempo en los pacientes que más lo necesitan, usando criterios de riesgo y de complejidad para decidir a quién visitar primero (Manzano García &amp; Morillo Verdugo, 2018). La Motivación se centra en la relación con el paciente y en su adherencia: mediante la entrevista motivacional, el farmacéutico trabaja las creencias y las dificultades que llevan a alguien a no tomar bien su tratamiento y busca acuerdos en vez de limitarse a dar instrucciones (Manzano García et al., 2018). Por último, la Oportunidad apunta a llegar al paciente más allá del box en su casa, por teléfono o con apoyo de herramientas digitales para resolver a tiempo lo que vaya surgiendo (Juárez Giménez &amp; Morillo Verdugo, 2026). Son estos tres pilares los que dan forma al protocolo que aquí se propone.</w:t>
+      </w:r>
+    </w:p>
+    <w:p>
+      <w:pPr>
+        <w:pStyle w:val="Ttulo2"/>
+      </w:pPr>
       <w:bookmarkStart w:id="8" w:name="_Toc235014856"/>
       <w:r>
-        <w:t>1.4 Atención Farmacéutica domiciliaria</w:t>
+        <w:t xml:space="preserve">1.6 Atención Farmacéutica domiciliaria</w:t>
       </w:r>
       <w:bookmarkEnd w:id="8"/>
     </w:p>
@@ -3641,7 +3734,10 @@
         <w:jc w:val="both"/>
       </w:pPr>
       <w:r>
-        <w:t>Más allá del recorrido y de los tipos de visita, conviene detenerse en el valor que aporta atender al paciente en su propio domicilio. La Atención Farmacéutica es una labor compleja, porque el paciente entrega información personal al Químico Farmacéutico, lo que exige del profesional habilidades de comunicación para generar un vínculo y la confianza necesarios para reunir todo lo que se requiere, tanto la farmacoterapia, como los problemas que la propia persona reconoce y así intervenir de forma adecuada. Si bien, la visita domiciliaria demanda más recursos que la atención en box, como el traslado y un mayor tiempo por los desplazamientos, ofrece una ventaja clara para abordar los tres pilares del Modelo CMO.</w:t>
+        <w:rPr>
+          <w:rFonts w:ascii="Arial" w:hAnsi="Arial" w:cs="Arial"/>
+        </w:rPr>
+        <w:t>Una vez presentado el Modelo CMO, conviene detenerse en el valor que aporta atender al paciente en su propio domicilio. La Atención Farmacéutica es una labor compleja, porque el paciente entrega información personal al Químico Farmacéutico, lo que exige del profesional habilidades de comunicación para generar un vínculo y la confianza necesarios para reunir todo lo que se requiere, tanto la farmacoterapia, como los problemas que la propia persona reconoce y así intervenir de forma adecuada. Si bien, la visita domiciliaria demanda más recursos que la atención en box, como el traslado y un mayor tiempo por los desplazamientos, ofrece una ventaja clara para abordar los tres pilares del Modelo CMO.</w:t>
       </w:r>
     </w:p>
     <w:p>
@@ -3670,99 +3766,6 @@
       </w:pPr>
       <w:r>
         <w:t>Finalmente, en cuanto a la Oportunidad, la visita al domicilio favorece un vínculo más cercano: al encontrarse en un espacio seguro, el paciente tiende a abrirse y a compartir más información, y gana confianza para preguntar y aclarar sus dudas. Esta intervención constituye una oportunidad para recalcar el rol del Químico Farmacéutico e incentivar a acercarse a la farmacia o a comunicarse por vía telefónica cuando lo necesite. Sentirse acompañado a lo largo del tratamiento mejora el ánimo de los pacientes y los motiva a mantener su farmacoterapia.</w:t>
-      </w:r>
-    </w:p>
-    <w:p>
-      <w:pPr>
-        <w:pStyle w:val="Ttulo2"/>
-      </w:pPr>
-      <w:bookmarkStart w:id="9" w:name="_Toc235014857"/>
-      <w:r>
-        <w:t>1.5 Adherencia, polifarmacia y seguimiento farmacoterapéutico</w:t>
-      </w:r>
-      <w:bookmarkEnd w:id="9"/>
-    </w:p>
-    <w:p>
-      <w:pPr>
-        <w:spacing w:after="120" w:line="360" w:lineRule="auto"/>
-        <w:jc w:val="both"/>
-      </w:pPr>
-      <w:r>
-        <w:t xml:space="preserve">Que un tratamiento esté indicado no asegura que el paciente lo tome como corresponde. La adherencia, entendida como el grado en que la persona sigue las indicaciones acordadas con el equipo de salud, es uno de los factores que más influye en el control de estas enfermedades y suele ser baja en quienes usan varios medicamentos a la vez (Haynes et al., 1979; Cutler &amp; Everett, 2010; Martín Alfonso, 2004; Morales &amp; Estela, 2015; Abegaz et al., 2017; </w:t>
-      </w:r>
-      <w:proofErr w:type="spellStart"/>
-      <w:r>
-        <w:t>Kolandaivelu</w:t>
-      </w:r>
-      <w:proofErr w:type="spellEnd"/>
-      <w:r>
-        <w:t xml:space="preserve"> et al., 2014). En los usuarios que además dependen de otros o tienen dificultades para llegar al centro, la visita domiciliaria pasa a ser la mejor oportunidad para revisar la terapia, resolver dudas y reforzar la adherencia.</w:t>
-      </w:r>
-    </w:p>
-    <w:p>
-      <w:pPr>
-        <w:spacing w:after="120" w:line="360" w:lineRule="auto"/>
-        <w:jc w:val="both"/>
-      </w:pPr>
-      <w:r>
-        <w:t>La dificultad es mayor en los pacientes que toman muchos medicamentos, tienen problemas sociales o presentan condiciones propias de la edad, en quienes la adherencia es más frágil (Maher, Hanlon &amp; Hajjar, 2014; Manzano García &amp; Morillo Verdugo, 2018).</w:t>
-      </w:r>
-    </w:p>
-    <w:p>
-      <w:pPr>
-        <w:spacing w:after="120" w:line="360" w:lineRule="auto"/>
-        <w:jc w:val="both"/>
-      </w:pPr>
-      <w:r>
-        <w:t xml:space="preserve">La forma de realizar una Atención Farmacéutica ha cambiado bastante en las últimas décadas. Al comienzo el trabajo giraba en torno al medicamento y al control del gasto, con poca estructura (Calleja Hernández &amp; Morillo Verdugo, 2016). A medida que la </w:t>
-      </w:r>
-      <w:r>
-        <w:lastRenderedPageBreak/>
-        <w:t xml:space="preserve">población envejeció y aparecieron más pacientes con varias enfermedades a la vez, ese enfoque resultó insuficiente. Para ordenar el seguimiento surgieron métodos como el </w:t>
-      </w:r>
-      <w:proofErr w:type="spellStart"/>
-      <w:r>
-        <w:t>Dáder</w:t>
-      </w:r>
-      <w:proofErr w:type="spellEnd"/>
-      <w:r>
-        <w:t xml:space="preserve"> y, en Chile, el POLARIS, que ofrecen una manera sistemática de detectar los problemas relacionados con los medicamentos (PRM) y los resultados negativos asociados a la medicación (RNM) (</w:t>
-      </w:r>
-      <w:proofErr w:type="spellStart"/>
-      <w:r>
-        <w:t>Faus</w:t>
-      </w:r>
-      <w:proofErr w:type="spellEnd"/>
-      <w:r>
-        <w:t xml:space="preserve"> Dáder, 2018; Plaza, 2018; Ministerio de Salud de Chile, 2018a, 2019). Para clasificar estos problemas se suele recurrir al Tercer Consenso de Granada, que ordena los RNM según, si el tratamiento es necesario, efectivo y seguro (Comité de Consenso de Granada, 2007). Estos métodos expuestos aportaron rigor, aunque llevarlos por completo a la Atención Primaria ha sido difícil, sobre todo en la parte conductual y en la logística de la visita a domicilio.</w:t>
-      </w:r>
-    </w:p>
-    <w:p>
-      <w:pPr>
-        <w:pStyle w:val="Ttulo2"/>
-      </w:pPr>
-      <w:bookmarkStart w:id="11" w:name="_Toc235014859"/>
-      <w:r>
-        <w:t>1.6 Modelo CMO</w:t>
-      </w:r>
-      <w:bookmarkEnd w:id="11"/>
-    </w:p>
-    <w:p>
-      <w:pPr>
-        <w:spacing w:after="120" w:line="360" w:lineRule="auto"/>
-        <w:jc w:val="both"/>
-      </w:pPr>
-      <w:r>
-        <w:t>Sobre esa base, el marco que hoy se usa como referencia para modernizar la Atención Farmacéutica es el Modelo CMO Capacidad, Motivación y Oportunidad, desarrollado en España y validado por su sociedad de farmacia hospitalaria (Calleja Hernández &amp; Morillo Verdugo, 2016). Su valor está en ordenar la atención en torno a tres ideas sencillas que se pueden llevar al domicilio del paciente; además, investigaciones recientes han aplicado este modelo en patologías de alta complejidad, como las coagulopatías congénitas (Juárez Giménez &amp; Morillo Verdugo, 2026), evidenciando su versatilidad clínica y su capacidad de adaptación a distintos contextos sociosanitarios.</w:t>
-      </w:r>
-    </w:p>
-    <w:p>
-      <w:pPr>
-        <w:spacing w:after="120" w:line="360" w:lineRule="auto"/>
-        <w:jc w:val="both"/>
-      </w:pPr>
-      <w:r>
-        <w:t>La Capacidad tiene directa relación con priorizar, en lugar de atender a todos por igual, propone concentrar el tiempo en los pacientes que más lo necesitan, usando criterios de riesgo y de complejidad para decidir a quién visitar primero (Manzano García &amp; Morillo Verdugo, 2018). La Motivación se centra en la relación con el paciente y en su adherencia: mediante la entrevista motivacional, el farmacéutico trabaja las creencias y las dificultades que llevan a alguien a no tomar bien su tratamiento y busca acuerdos en vez de limitarse a dar instrucciones (Manzano García et al., 2018). Por último, la Oportunidad apunta a llegar al paciente más allá del box en su casa, por teléfono o con apoyo de herramientas digitales para resolver a tiempo lo que vaya surgiendo (Juárez Giménez &amp; Morillo Verdugo, 2026). Son estos tres pilares los que dan forma al protocolo que aquí se propone.</w:t>
       </w:r>
     </w:p>
     <w:p>

</xml_diff>

<commit_message>
Coherencia Cap I: mueve parrafo de Faundez a Justificacion (1.8) y ajusta frase de razones epidemiologicas/gestion
</commit_message>
<xml_diff>
--- a/Tesis AVANCE 1 - Rev DJP (3).docx
+++ b/Tesis AVANCE 1 - Rev DJP (3).docx
@@ -3848,52 +3848,51 @@
     </w:p>
     <w:p>
       <w:pPr>
+        <w:pStyle w:val="Ttulo2"/>
+      </w:pPr>
+      <w:bookmarkStart w:id="13" w:name="_Toc235014861"/>
+      <w:r>
+        <w:t>1.8 Justificación y planteamiento del problema</w:t>
+      </w:r>
+      <w:bookmarkEnd w:id="13"/>
+    </w:p>
+    <w:p>
+      <w:pPr>
         <w:spacing w:after="120" w:line="360" w:lineRule="auto"/>
         <w:jc w:val="both"/>
       </w:pPr>
       <w:r>
+        <w:rPr>
+          <w:rFonts w:ascii="Arial" w:hAnsi="Arial" w:cs="Arial"/>
+        </w:rPr>
+        <w:t>Las razones de contar con este protocolo son epidemiológicas y de gestión. A la carga de las enfermedades cardiovasculares, ya descrita, se suma un motivo de gestión: ordenar la atención ayuda a aprovechar mejor el Fondo de Farmacia (FOFAR), que financia la presencia del Químico Farmacéutico en la Atención Primaria y el acceso a los medicamentos para la hipertensión, la diabetes y la dislipidemia (Ministerio de Salud de Chile, 2018b, 2020).</w:t>
+      </w:r>
+    </w:p>
+    <w:p>
+      <w:pPr>
+        <w:spacing w:after="120" w:line="360" w:lineRule="auto"/>
+        <w:jc w:val="both"/>
+      </w:pPr>
+      <w:r>
+        <w:t>Dado lo anterior, este trabajo propone un protocolo que estructure la entrevista, ayude a detectar a tiempo los problemas relacionados con los medicamentos y ordene el registro de lo realizado. La visita a domicilio consume bastante tiempo, por lo que conviene aprovechar bien cada instancia.</w:t>
+      </w:r>
+    </w:p>
+    <w:p>
+      <w:pPr>
+        <w:spacing w:after="120" w:line="360" w:lineRule="auto"/>
+        <w:jc w:val="both"/>
+      </w:pPr>
+      <w:r>
+        <w:t>El problema detectado es que esas visitas se llevan a cabo sin un procedimiento escrito y estandarizado que las respalde. Actualmente la atención ingresa por derivación y se prioriza a los pacientes más descompensados, y el Químico Farmacéutico, que cuenta con la formación necesaria para conducir la entrevista, deja constancia de lo realizado en la ficha clínica y en hojas de apoyo. Cabe considerar que lo que falta no es el criterio ni el registro, sino un documento común que ordene la priorización de los pacientes, la forma de conducir la visita y el registro de la atención, de modo que el trabajo sea trazable, comparable entre profesionales y posible de evaluar en el tiempo.</w:t>
+      </w:r>
+    </w:p>
+    <w:p>
+      <w:pPr>
+        <w:spacing w:after="120" w:line="360" w:lineRule="auto"/>
+        <w:jc w:val="both"/>
+      </w:pPr>
+      <w:r>
         <w:t>La magnitud de esa necesidad había quedado documentada en el mismo centro. Una memoria anterior, que evaluó el programa de Atención Farmacéutica siguiendo a veinte usuarios, encontró que todos tenían al menos un problema relacionado con sus medicamentos y que solo el 15% era adherente al inicio del seguimiento, cifra que mejoró de manera importante tras la intervención del farmacéutico (Faúndez Navarrete, 2020). Ese resultado deja ver dos cosas: que el trabajo farmacéutico en terreno sí influye en los pacientes y que hasta ahora se ha hecho de una forma valiosa, pero poco sistematizada. De lo antes expuesto, surge la idea de esta memoria, cuyo objetivo es ordenar la labor en un protocolo que pueda repetirse y evaluarse.</w:t>
-      </w:r>
-    </w:p>
-    <w:p>
-      <w:pPr>
-        <w:pStyle w:val="Ttulo2"/>
-      </w:pPr>
-      <w:bookmarkStart w:id="13" w:name="_Toc235014861"/>
-      <w:r>
-        <w:t>1.8 Justificación y planteamiento del problema</w:t>
-      </w:r>
-      <w:bookmarkEnd w:id="13"/>
-    </w:p>
-    <w:p>
-      <w:pPr>
-        <w:spacing w:after="120" w:line="360" w:lineRule="auto"/>
-        <w:jc w:val="both"/>
-      </w:pPr>
-      <w:r>
-        <w:t xml:space="preserve">Las razones de contar con este protocolo son epidemiológicas y de gestión. A la carga de las enfermedades cardiovasculares se suma un motivo de gestión: ordenar la atención ayuda a aprovechar mejor el Fondo de Farmacia (FOFAR), que financia la presencia del </w:t>
-      </w:r>
-      <w:r>
-        <w:lastRenderedPageBreak/>
-        <w:t>Químico Farmacéutico en la Atención Primaria y el acceso a los medicamentos para la hipertensión, la diabetes y la dislipidemia (Ministerio de Salud de Chile, 2018b, 2020).</w:t>
-      </w:r>
-    </w:p>
-    <w:p>
-      <w:pPr>
-        <w:spacing w:after="120" w:line="360" w:lineRule="auto"/>
-        <w:jc w:val="both"/>
-      </w:pPr>
-      <w:r>
-        <w:t>Dado lo anterior, este trabajo propone un protocolo que estructure la entrevista, ayude a detectar a tiempo los problemas relacionados con los medicamentos y ordene el registro de lo realizado. La visita a domicilio consume bastante tiempo, por lo que conviene aprovechar bien cada instancia.</w:t>
-      </w:r>
-    </w:p>
-    <w:p>
-      <w:pPr>
-        <w:spacing w:after="120" w:line="360" w:lineRule="auto"/>
-        <w:jc w:val="both"/>
-      </w:pPr>
-      <w:r>
-        <w:t>El problema detectado es que esas visitas se llevan a cabo sin un procedimiento escrito y estandarizado que las respalde. Actualmente la atención ingresa por derivación y se prioriza a los pacientes más descompensados, y el Químico Farmacéutico, que cuenta con la formación necesaria para conducir la entrevista, deja constancia de lo realizado en la ficha clínica y en hojas de apoyo. Cabe considerar que lo que falta no es el criterio ni el registro, sino un documento común que ordene la priorización de los pacientes, la forma de conducir la visita y el registro de la atención, de modo que el trabajo sea trazable, comparable entre profesionales y posible de evaluar en el tiempo.</w:t>
       </w:r>
     </w:p>
     <w:p>

</xml_diff>

<commit_message>
Cap II: enlaza cada seccion con su objetivo de forma uniforme, limpia titulo 2.4, corrige paralelismo en 2.3 y uniforma citas de Tabla 1 (MINSAL -> APA)
</commit_message>
<xml_diff>
--- a/Tesis AVANCE 1 - Rev DJP (3).docx
+++ b/Tesis AVANCE 1 - Rev DJP (3).docx
@@ -4246,8 +4246,10 @@
               <w:rPr/>
             </w:pPr>
             <w:r>
-              <w:rPr/>
-              <w:t>Orientación Técnica del Programa de Salud Cardiovascular y del Fondo de Farmacia (MINSAL); pilar de Capacidad del Modelo CMO</w:t>
+              <w:rPr>
+                <w:rFonts w:ascii="Arial" w:hAnsi="Arial" w:cs="Arial"/>
+              </w:rPr>
+              <w:t>Orientación Técnica del Programa de Salud Cardiovascular y del Fondo de Farmacia (Ministerio de Salud de Chile, 2017b, 2018b, 2020); pilar de Capacidad del Modelo CMO</w:t>
             </w:r>
           </w:p>
         </w:tc>
@@ -4293,8 +4295,10 @@
               <w:rPr/>
             </w:pPr>
             <w:r>
-              <w:rPr/>
-              <w:t>Guía de Atención Farmacéutica y Seguimiento Farmacoterapéutico en APS (MINSAL); pilar de Motivación</w:t>
+              <w:rPr>
+                <w:rFonts w:ascii="Arial" w:hAnsi="Arial" w:cs="Arial"/>
+              </w:rPr>
+              <w:t>Guía de Atención Farmacéutica y Seguimiento Farmacoterapéutico en APS (Ministerio de Salud de Chile, 2018a); pilar de Motivación</w:t>
             </w:r>
           </w:p>
         </w:tc>
@@ -4415,26 +4419,13 @@
         <w:spacing w:after="120" w:line="360" w:lineRule="auto"/>
         <w:jc w:val="both"/>
       </w:pPr>
-      <w:r>
-        <w:t xml:space="preserve">El protocolo está pensado para las personas adultas y mayores del Programa de Salud Cardiovascular del CESFAM Villa </w:t>
-      </w:r>
       <w:proofErr w:type="spellStart"/>
-      <w:r>
-        <w:t>Nonguén</w:t>
-      </w:r>
       <w:proofErr w:type="spellEnd"/>
       <w:r>
-        <w:t xml:space="preserve">, con prioridad en </w:t>
-      </w:r>
-      <w:r>
-        <w:t>pacientes con polifarmacia</w:t>
-      </w:r>
-      <w:r>
-        <w:t xml:space="preserve">, dependen de un cuidador, se descompensan con frecuencia o tienen dificultades para acudir al centro. Esta forma de priorizar responde al pilar de Capacidad del Modelo CMO, </w:t>
-      </w:r>
-      <w:r>
-        <w:lastRenderedPageBreak/>
-        <w:t>que orienta el tiempo del farmacéutico hacia los pacientes más complejos y que más se benefician del seguimiento.</w:t>
+        <w:rPr>
+          <w:rFonts w:ascii="Arial" w:hAnsi="Arial" w:cs="Arial"/>
+        </w:rPr>
+        <w:t>Para responder al segundo objetivo, se definieron los criterios para priorizar a los pacientes y el flujograma de la visita. El protocolo está pensado para las personas adultas y mayores del Programa de Salud Cardiovascular del CESFAM Villa Nonguén, con prioridad en pacientes con polifarmacia, que dependen de un cuidador, que se descompensan con frecuencia o que tienen dificultades para acudir al centro. Esta forma de priorizar responde al pilar de Capacidad del Modelo CMO, que orienta el tiempo del farmacéutico hacia los pacientes más complejos y que más se benefician del seguimiento.</w:t>
       </w:r>
     </w:p>
     <w:p>
@@ -4793,8 +4784,7 @@
       <w:bookmarkStart w:id="26" w:name="_Toc234430365"/>
       <w:bookmarkStart w:id="27" w:name="_Toc235014869"/>
       <w:r>
-        <w:lastRenderedPageBreak/>
-        <w:t>2.4 Instrumentos y herramientas de la atención (Objetivo 3)</w:t>
+        <w:t>2.4 Instrumentos y herramientas de la atención</w:t>
       </w:r>
       <w:bookmarkEnd w:id="26"/>
       <w:bookmarkEnd w:id="27"/>
@@ -4811,7 +4801,7 @@
           <w:rFonts w:ascii="Arial" w:hAnsi="Arial" w:cs="Arial"/>
           <w:sz w:val="24"/>
         </w:rPr>
-        <w:t>Como parte del diseño del protocolo se seleccionaron y adaptaron herramientas sencillas, compatibles con la rutina del CESFAM. La adherencia se evalúa con el test de Morisky-Green-Levine de cuatro preguntas (Morisky, Green &amp; Levine, 1986; Beyhaghi et al., 2016), incluido en el Anexo 2, que en algunos casos se complementa con el test de Batalla, el cual permite conocer el grado de conocimiento que el paciente tiene sobre su enfermedad (Batalla et al., 1984). El protocolo contempla también que el químico farmacéutico, como parte de sus competencias, interprete la información clínica disponible para orientar la atención, anticipar los problemas relacionados con los medicamentos y reforzar la adherencia, apoyándose en herramientas como el método Dáder y los pilares del Modelo CMO. Durante la visita domiciliaria esta valoración se complementa con la medición de la presión arterial mediante un tensiómetro de brazo, práctica ya habitual que permite estimar el grado de compensación del paciente en el momento.</w:t>
+        <w:t>Para responder al tercer objetivo, se seleccionaron y adaptaron herramientas sencillas, compatibles con la rutina del CESFAM. La adherencia se evalúa con el test de Morisky-Green-Levine de cuatro preguntas (Morisky, Green &amp; Levine, 1986; Beyhaghi et al., 2016), incluido en el Anexo 2, que en algunos casos se complementa con el test de Batalla, el cual permite conocer el grado de conocimiento que el paciente tiene sobre su enfermedad (Batalla et al., 1984). El protocolo contempla también que el químico farmacéutico, como parte de sus competencias, interprete la información clínica disponible para orientar la atención, anticipar los problemas relacionados con los medicamentos y reforzar la adherencia, apoyándose en herramientas como el método Dáder y los pilares del Modelo CMO. Durante la visita domiciliaria esta valoración se complementa con la medición de la presión arterial mediante un tensiómetro de brazo, práctica ya habitual que permite estimar el grado de compensación del paciente en el momento.</w:t>
       </w:r>
     </w:p>
     <w:p>

</xml_diff>

<commit_message>
Agrega referencia Norma Tecnica N140 farmacovigilancia (MINSAL 2017c) y su cita en 2.4; 31 referencias
</commit_message>
<xml_diff>
--- a/Tesis AVANCE 1 - Rev DJP (3).docx
+++ b/Tesis AVANCE 1 - Rev DJP (3).docx
@@ -4809,25 +4809,13 @@
         <w:spacing w:after="120" w:line="360" w:lineRule="auto"/>
         <w:jc w:val="both"/>
       </w:pPr>
-      <w:r>
-        <w:t>Los problemas relacionados con los medicamentos y los resultados negativos asociados a la medicación se ordenan según sean</w:t>
-      </w:r>
-      <w:r>
-        <w:t xml:space="preserve"> de</w:t>
-      </w:r>
-      <w:r>
-        <w:t xml:space="preserve"> necesidad, efectividad o seguridad, siguiendo el Consenso de Granada (Comité de Consenso de Granada, 2007), como se detalla en el Anexo 6, y se acompañan de una lista de medidas para resolverlos </w:t>
-      </w:r>
       <w:proofErr w:type="gramStart"/>
-      <w:r>
-        <w:t>como</w:t>
-      </w:r>
       <w:proofErr w:type="gramEnd"/>
       <w:r>
-        <w:t xml:space="preserve"> por ejemplo: </w:t>
-      </w:r>
-      <w:r>
-        <w:t>ajustar la dosis, cambiar el horario, iniciar o suspender un tratamiento, cambiar por una alternativa o educar al paciente, recogida en el Anexo 7. Las reacciones adversas se notifican según la Norma General Técnica de farmacovigilancia del Ministerio de Salud, usando el algoritmo OMS-REDRAM. Como apoyo se incorpora una ficha de conciliación (Anexo 1), una ficha de seguimiento farmacoterapéutico (Anexo 3), una hoja con el esquema de horarios (Anexo 4) y un protocolo de llamada telefónica para agendar (Anexo 5).</w:t>
+        <w:rPr>
+          <w:rFonts w:ascii="Arial" w:hAnsi="Arial" w:cs="Arial"/>
+        </w:rPr>
+        <w:t>Los problemas relacionados con los medicamentos y los resultados negativos asociados a la medicación se ordenan según sean de necesidad, efectividad o seguridad, siguiendo el Consenso de Granada (Comité de Consenso de Granada, 2007), como se detalla en el Anexo 6, y se acompañan de una lista de medidas para resolverlos como por ejemplo: ajustar la dosis, cambiar el horario, iniciar o suspender un tratamiento, cambiar por una alternativa o educar al paciente, recogida en el Anexo 7. Las reacciones adversas se notifican según la Norma Técnica N.º 140 sobre el Sistema Nacional de Farmacovigilancia de Productos Farmacéuticos de Uso Humano (Ministerio de Salud de Chile, 2017c), usando el algoritmo OMS-REDRAM. Como apoyo se incorpora una ficha de conciliación (Anexo 1), una ficha de seguimiento farmacoterapéutico (Anexo 3), una hoja con el esquema de horarios (Anexo 4) y un protocolo de llamada telefónica para agendar (Anexo 5).</w:t>
       </w:r>
     </w:p>
     <w:p>
@@ -5377,6 +5365,17 @@
       <w:r>
         <w:lastRenderedPageBreak/>
         <w:t>Ministerio de Salud de Chile. (2017b). Orientación técnica Programa de Salud Cardiovascular. Gobierno de Chile.</w:t>
+      </w:r>
+    </w:p>
+    <w:p>
+      <w:pPr>
+        <w:spacing w:after="120" w:line="360" w:lineRule="auto"/>
+        <w:ind w:left="720" w:hanging="720"/>
+        <w:jc w:val="both"/>
+      </w:pPr>
+      <w:r>
+        <w:lastRenderedPageBreak/>
+        <w:t xml:space="preserve">Ministerio de Salud de Chile. (2017c). Norma Técnica N.º 140 sobre el Sistema Nacional de Farmacovigilancia de Productos Farmacéuticos de Uso Humano (Resolución Exenta N.º 2783). Gobierno de Chile.</w:t>
       </w:r>
     </w:p>
     <w:p>

</xml_diff>